<commit_message>
feat(platform-ai-guardrail): add context integrity and tool output validation
</commit_message>
<xml_diff>
--- a/src/main/resources/data/Commits HyFlo -- AI.docx
+++ b/src/main/resources/data/Commits HyFlo -- AI.docx
@@ -6203,7 +6203,6 @@
           <w:lang w:eastAsia="fr-FR"/>
         </w:rPr>
       </w:pPr>
-      <w:bookmarkStart w:id="0" w:name="_GoBack"/>
       <w:r>
         <w:rPr>
           <w:rFonts w:ascii="Times New Roman" w:eastAsia="Times New Roman" w:hAnsi="Times New Roman" w:cs="Times New Roman"/>
@@ -6748,7 +6747,6 @@
         <w:t>Java</w:t>
       </w:r>
     </w:p>
-    <w:bookmarkEnd w:id="0"/>
     <w:p>
       <w:pPr>
         <w:spacing w:after="0" w:line="240" w:lineRule="auto"/>
@@ -6779,6 +6777,7 @@
           <w:rFonts w:ascii="Times New Roman" w:eastAsia="Times New Roman" w:hAnsi="Times New Roman" w:cs="Times New Roman"/>
           <w:b/>
           <w:bCs/>
+          <w:color w:val="FF0000"/>
           <w:sz w:val="36"/>
           <w:szCs w:val="36"/>
           <w:lang w:eastAsia="fr-FR"/>
@@ -6789,6 +6788,7 @@
           <w:rFonts w:ascii="Times New Roman" w:eastAsia="Times New Roman" w:hAnsi="Times New Roman" w:cs="Times New Roman"/>
           <w:b/>
           <w:bCs/>
+          <w:color w:val="FF0000"/>
           <w:sz w:val="36"/>
           <w:szCs w:val="36"/>
           <w:lang w:eastAsia="fr-FR"/>
@@ -6801,16 +6801,18 @@
         <w:spacing w:before="100" w:beforeAutospacing="1" w:after="100" w:afterAutospacing="1" w:line="240" w:lineRule="auto"/>
         <w:rPr>
           <w:rFonts w:ascii="Times New Roman" w:eastAsia="Times New Roman" w:hAnsi="Times New Roman" w:cs="Times New Roman"/>
-          <w:sz w:val="24"/>
-          <w:szCs w:val="24"/>
-          <w:lang w:eastAsia="fr-FR"/>
-        </w:rPr>
-      </w:pPr>
-      <w:r>
-        <w:rPr>
-          <w:rFonts w:ascii="Times New Roman" w:eastAsia="Times New Roman" w:hAnsi="Times New Roman" w:cs="Times New Roman"/>
-          <w:b/>
-          <w:bCs/>
+          <w:color w:val="FF0000"/>
+          <w:sz w:val="24"/>
+          <w:szCs w:val="24"/>
+          <w:lang w:eastAsia="fr-FR"/>
+        </w:rPr>
+      </w:pPr>
+      <w:r>
+        <w:rPr>
+          <w:rFonts w:ascii="Times New Roman" w:eastAsia="Times New Roman" w:hAnsi="Times New Roman" w:cs="Times New Roman"/>
+          <w:b/>
+          <w:bCs/>
+          <w:color w:val="FF0000"/>
           <w:sz w:val="24"/>
           <w:szCs w:val="24"/>
           <w:lang w:eastAsia="fr-FR"/>
@@ -6820,6 +6822,7 @@
       <w:r>
         <w:rPr>
           <w:rFonts w:ascii="Times New Roman" w:eastAsia="Times New Roman" w:hAnsi="Times New Roman" w:cs="Times New Roman"/>
+          <w:color w:val="FF0000"/>
           <w:sz w:val="24"/>
           <w:szCs w:val="24"/>
           <w:lang w:eastAsia="fr-FR"/>
@@ -6830,6 +6833,7 @@
       <w:r>
         <w:rPr>
           <w:rFonts w:ascii="Courier New" w:eastAsia="Times New Roman" w:hAnsi="Courier New" w:cs="Courier New"/>
+          <w:color w:val="FF0000"/>
           <w:sz w:val="20"/>
           <w:szCs w:val="20"/>
           <w:lang w:eastAsia="fr-FR"/>
@@ -6840,6 +6844,7 @@
       <w:r>
         <w:rPr>
           <w:rFonts w:ascii="Courier New" w:eastAsia="Times New Roman" w:hAnsi="Courier New" w:cs="Courier New"/>
+          <w:color w:val="FF0000"/>
           <w:sz w:val="20"/>
           <w:szCs w:val="20"/>
           <w:lang w:eastAsia="fr-FR"/>
@@ -6852,16 +6857,18 @@
         <w:spacing w:before="100" w:beforeAutospacing="1" w:after="100" w:afterAutospacing="1" w:line="240" w:lineRule="auto"/>
         <w:rPr>
           <w:rFonts w:ascii="Times New Roman" w:eastAsia="Times New Roman" w:hAnsi="Times New Roman" w:cs="Times New Roman"/>
-          <w:sz w:val="24"/>
-          <w:szCs w:val="24"/>
-          <w:lang w:eastAsia="fr-FR"/>
-        </w:rPr>
-      </w:pPr>
-      <w:r>
-        <w:rPr>
-          <w:rFonts w:ascii="Times New Roman" w:eastAsia="Times New Roman" w:hAnsi="Times New Roman" w:cs="Times New Roman"/>
-          <w:b/>
-          <w:bCs/>
+          <w:color w:val="FF0000"/>
+          <w:sz w:val="24"/>
+          <w:szCs w:val="24"/>
+          <w:lang w:eastAsia="fr-FR"/>
+        </w:rPr>
+      </w:pPr>
+      <w:r>
+        <w:rPr>
+          <w:rFonts w:ascii="Times New Roman" w:eastAsia="Times New Roman" w:hAnsi="Times New Roman" w:cs="Times New Roman"/>
+          <w:b/>
+          <w:bCs/>
+          <w:color w:val="FF0000"/>
           <w:sz w:val="24"/>
           <w:szCs w:val="24"/>
           <w:lang w:eastAsia="fr-FR"/>
@@ -6871,6 +6878,7 @@
       <w:r>
         <w:rPr>
           <w:rFonts w:ascii="Times New Roman" w:eastAsia="Times New Roman" w:hAnsi="Times New Roman" w:cs="Times New Roman"/>
+          <w:color w:val="FF0000"/>
           <w:sz w:val="24"/>
           <w:szCs w:val="24"/>
           <w:lang w:eastAsia="fr-FR"/>
@@ -6884,16 +6892,18 @@
         <w:spacing w:before="100" w:beforeAutospacing="1" w:after="100" w:afterAutospacing="1" w:line="240" w:lineRule="auto"/>
         <w:rPr>
           <w:rFonts w:ascii="Times New Roman" w:eastAsia="Times New Roman" w:hAnsi="Times New Roman" w:cs="Times New Roman"/>
-          <w:sz w:val="24"/>
-          <w:szCs w:val="24"/>
-          <w:lang w:eastAsia="fr-FR"/>
-        </w:rPr>
-      </w:pPr>
-      <w:r>
-        <w:rPr>
-          <w:rFonts w:ascii="Times New Roman" w:eastAsia="Times New Roman" w:hAnsi="Times New Roman" w:cs="Times New Roman"/>
-          <w:b/>
-          <w:bCs/>
+          <w:color w:val="FF0000"/>
+          <w:sz w:val="24"/>
+          <w:szCs w:val="24"/>
+          <w:lang w:eastAsia="fr-FR"/>
+        </w:rPr>
+      </w:pPr>
+      <w:r>
+        <w:rPr>
+          <w:rFonts w:ascii="Times New Roman" w:eastAsia="Times New Roman" w:hAnsi="Times New Roman" w:cs="Times New Roman"/>
+          <w:b/>
+          <w:bCs/>
+          <w:color w:val="FF0000"/>
           <w:sz w:val="24"/>
           <w:szCs w:val="24"/>
           <w:lang w:eastAsia="fr-FR"/>
@@ -6903,6 +6913,7 @@
       <w:r>
         <w:rPr>
           <w:rFonts w:ascii="Times New Roman" w:eastAsia="Times New Roman" w:hAnsi="Times New Roman" w:cs="Times New Roman"/>
+          <w:color w:val="FF0000"/>
           <w:sz w:val="24"/>
           <w:szCs w:val="24"/>
           <w:lang w:eastAsia="fr-FR"/>
@@ -6916,16 +6927,18 @@
         <w:spacing w:before="100" w:beforeAutospacing="1" w:after="100" w:afterAutospacing="1" w:line="240" w:lineRule="auto"/>
         <w:rPr>
           <w:rFonts w:ascii="Times New Roman" w:eastAsia="Times New Roman" w:hAnsi="Times New Roman" w:cs="Times New Roman"/>
-          <w:sz w:val="24"/>
-          <w:szCs w:val="24"/>
-          <w:lang w:eastAsia="fr-FR"/>
-        </w:rPr>
-      </w:pPr>
-      <w:r>
-        <w:rPr>
-          <w:rFonts w:ascii="Times New Roman" w:eastAsia="Times New Roman" w:hAnsi="Times New Roman" w:cs="Times New Roman"/>
-          <w:b/>
-          <w:bCs/>
+          <w:color w:val="FF0000"/>
+          <w:sz w:val="24"/>
+          <w:szCs w:val="24"/>
+          <w:lang w:eastAsia="fr-FR"/>
+        </w:rPr>
+      </w:pPr>
+      <w:r>
+        <w:rPr>
+          <w:rFonts w:ascii="Times New Roman" w:eastAsia="Times New Roman" w:hAnsi="Times New Roman" w:cs="Times New Roman"/>
+          <w:b/>
+          <w:bCs/>
+          <w:color w:val="FF0000"/>
           <w:sz w:val="24"/>
           <w:szCs w:val="24"/>
           <w:lang w:eastAsia="fr-FR"/>
@@ -6942,14 +6955,16 @@
         <w:spacing w:before="100" w:beforeAutospacing="1" w:after="100" w:afterAutospacing="1" w:line="240" w:lineRule="auto"/>
         <w:rPr>
           <w:rFonts w:ascii="Times New Roman" w:eastAsia="Times New Roman" w:hAnsi="Times New Roman" w:cs="Times New Roman"/>
-          <w:sz w:val="24"/>
-          <w:szCs w:val="24"/>
-          <w:lang w:eastAsia="fr-FR"/>
-        </w:rPr>
-      </w:pPr>
-      <w:r>
-        <w:rPr>
-          <w:rFonts w:ascii="Courier New" w:eastAsia="Times New Roman" w:hAnsi="Courier New" w:cs="Courier New"/>
+          <w:color w:val="FF0000"/>
+          <w:sz w:val="24"/>
+          <w:szCs w:val="24"/>
+          <w:lang w:eastAsia="fr-FR"/>
+        </w:rPr>
+      </w:pPr>
+      <w:r>
+        <w:rPr>
+          <w:rFonts w:ascii="Courier New" w:eastAsia="Times New Roman" w:hAnsi="Courier New" w:cs="Courier New"/>
+          <w:color w:val="FF0000"/>
           <w:sz w:val="20"/>
           <w:szCs w:val="20"/>
           <w:lang w:eastAsia="fr-FR"/>
@@ -6966,14 +6981,16 @@
         <w:spacing w:before="100" w:beforeAutospacing="1" w:after="100" w:afterAutospacing="1" w:line="240" w:lineRule="auto"/>
         <w:rPr>
           <w:rFonts w:ascii="Times New Roman" w:eastAsia="Times New Roman" w:hAnsi="Times New Roman" w:cs="Times New Roman"/>
-          <w:sz w:val="24"/>
-          <w:szCs w:val="24"/>
-          <w:lang w:eastAsia="fr-FR"/>
-        </w:rPr>
-      </w:pPr>
-      <w:r>
-        <w:rPr>
-          <w:rFonts w:ascii="Courier New" w:eastAsia="Times New Roman" w:hAnsi="Courier New" w:cs="Courier New"/>
+          <w:color w:val="FF0000"/>
+          <w:sz w:val="24"/>
+          <w:szCs w:val="24"/>
+          <w:lang w:eastAsia="fr-FR"/>
+        </w:rPr>
+      </w:pPr>
+      <w:r>
+        <w:rPr>
+          <w:rFonts w:ascii="Courier New" w:eastAsia="Times New Roman" w:hAnsi="Courier New" w:cs="Courier New"/>
+          <w:color w:val="FF0000"/>
           <w:sz w:val="20"/>
           <w:szCs w:val="20"/>
           <w:lang w:eastAsia="fr-FR"/>
@@ -6990,14 +7007,16 @@
         <w:spacing w:before="100" w:beforeAutospacing="1" w:after="100" w:afterAutospacing="1" w:line="240" w:lineRule="auto"/>
         <w:rPr>
           <w:rFonts w:ascii="Times New Roman" w:eastAsia="Times New Roman" w:hAnsi="Times New Roman" w:cs="Times New Roman"/>
-          <w:sz w:val="24"/>
-          <w:szCs w:val="24"/>
-          <w:lang w:eastAsia="fr-FR"/>
-        </w:rPr>
-      </w:pPr>
-      <w:r>
-        <w:rPr>
-          <w:rFonts w:ascii="Courier New" w:eastAsia="Times New Roman" w:hAnsi="Courier New" w:cs="Courier New"/>
+          <w:color w:val="FF0000"/>
+          <w:sz w:val="24"/>
+          <w:szCs w:val="24"/>
+          <w:lang w:eastAsia="fr-FR"/>
+        </w:rPr>
+      </w:pPr>
+      <w:r>
+        <w:rPr>
+          <w:rFonts w:ascii="Courier New" w:eastAsia="Times New Roman" w:hAnsi="Courier New" w:cs="Courier New"/>
+          <w:color w:val="FF0000"/>
           <w:sz w:val="20"/>
           <w:szCs w:val="20"/>
           <w:lang w:eastAsia="fr-FR"/>
@@ -7014,14 +7033,16 @@
         <w:spacing w:before="100" w:beforeAutospacing="1" w:after="100" w:afterAutospacing="1" w:line="240" w:lineRule="auto"/>
         <w:rPr>
           <w:rFonts w:ascii="Times New Roman" w:eastAsia="Times New Roman" w:hAnsi="Times New Roman" w:cs="Times New Roman"/>
-          <w:sz w:val="24"/>
-          <w:szCs w:val="24"/>
-          <w:lang w:eastAsia="fr-FR"/>
-        </w:rPr>
-      </w:pPr>
-      <w:r>
-        <w:rPr>
-          <w:rFonts w:ascii="Courier New" w:eastAsia="Times New Roman" w:hAnsi="Courier New" w:cs="Courier New"/>
+          <w:color w:val="FF0000"/>
+          <w:sz w:val="24"/>
+          <w:szCs w:val="24"/>
+          <w:lang w:eastAsia="fr-FR"/>
+        </w:rPr>
+      </w:pPr>
+      <w:r>
+        <w:rPr>
+          <w:rFonts w:ascii="Courier New" w:eastAsia="Times New Roman" w:hAnsi="Courier New" w:cs="Courier New"/>
+          <w:color w:val="FF0000"/>
           <w:sz w:val="20"/>
           <w:szCs w:val="20"/>
           <w:lang w:eastAsia="fr-FR"/>
@@ -7034,16 +7055,18 @@
         <w:spacing w:before="100" w:beforeAutospacing="1" w:after="100" w:afterAutospacing="1" w:line="240" w:lineRule="auto"/>
         <w:rPr>
           <w:rFonts w:ascii="Times New Roman" w:eastAsia="Times New Roman" w:hAnsi="Times New Roman" w:cs="Times New Roman"/>
-          <w:sz w:val="24"/>
-          <w:szCs w:val="24"/>
-          <w:lang w:eastAsia="fr-FR"/>
-        </w:rPr>
-      </w:pPr>
-      <w:r>
-        <w:rPr>
-          <w:rFonts w:ascii="Times New Roman" w:eastAsia="Times New Roman" w:hAnsi="Times New Roman" w:cs="Times New Roman"/>
-          <w:b/>
-          <w:bCs/>
+          <w:color w:val="FF0000"/>
+          <w:sz w:val="24"/>
+          <w:szCs w:val="24"/>
+          <w:lang w:eastAsia="fr-FR"/>
+        </w:rPr>
+      </w:pPr>
+      <w:r>
+        <w:rPr>
+          <w:rFonts w:ascii="Times New Roman" w:eastAsia="Times New Roman" w:hAnsi="Times New Roman" w:cs="Times New Roman"/>
+          <w:b/>
+          <w:bCs/>
+          <w:color w:val="FF0000"/>
           <w:sz w:val="24"/>
           <w:szCs w:val="24"/>
           <w:lang w:eastAsia="fr-FR"/>
@@ -7060,14 +7083,16 @@
         <w:spacing w:before="100" w:beforeAutospacing="1" w:after="100" w:afterAutospacing="1" w:line="240" w:lineRule="auto"/>
         <w:rPr>
           <w:rFonts w:ascii="Times New Roman" w:eastAsia="Times New Roman" w:hAnsi="Times New Roman" w:cs="Times New Roman"/>
-          <w:sz w:val="24"/>
-          <w:szCs w:val="24"/>
-          <w:lang w:eastAsia="fr-FR"/>
-        </w:rPr>
-      </w:pPr>
-      <w:r>
-        <w:rPr>
-          <w:rFonts w:ascii="Times New Roman" w:eastAsia="Times New Roman" w:hAnsi="Times New Roman" w:cs="Times New Roman"/>
+          <w:color w:val="FF0000"/>
+          <w:sz w:val="24"/>
+          <w:szCs w:val="24"/>
+          <w:lang w:eastAsia="fr-FR"/>
+        </w:rPr>
+      </w:pPr>
+      <w:r>
+        <w:rPr>
+          <w:rFonts w:ascii="Times New Roman" w:eastAsia="Times New Roman" w:hAnsi="Times New Roman" w:cs="Times New Roman"/>
+          <w:color w:val="FF0000"/>
           <w:sz w:val="24"/>
           <w:szCs w:val="24"/>
           <w:lang w:eastAsia="fr-FR"/>
@@ -7084,14 +7109,16 @@
         <w:spacing w:before="100" w:beforeAutospacing="1" w:after="100" w:afterAutospacing="1" w:line="240" w:lineRule="auto"/>
         <w:rPr>
           <w:rFonts w:ascii="Times New Roman" w:eastAsia="Times New Roman" w:hAnsi="Times New Roman" w:cs="Times New Roman"/>
-          <w:sz w:val="24"/>
-          <w:szCs w:val="24"/>
-          <w:lang w:eastAsia="fr-FR"/>
-        </w:rPr>
-      </w:pPr>
-      <w:r>
-        <w:rPr>
-          <w:rFonts w:ascii="Times New Roman" w:eastAsia="Times New Roman" w:hAnsi="Times New Roman" w:cs="Times New Roman"/>
+          <w:color w:val="FF0000"/>
+          <w:sz w:val="24"/>
+          <w:szCs w:val="24"/>
+          <w:lang w:eastAsia="fr-FR"/>
+        </w:rPr>
+      </w:pPr>
+      <w:r>
+        <w:rPr>
+          <w:rFonts w:ascii="Times New Roman" w:eastAsia="Times New Roman" w:hAnsi="Times New Roman" w:cs="Times New Roman"/>
+          <w:color w:val="FF0000"/>
           <w:sz w:val="24"/>
           <w:szCs w:val="24"/>
           <w:lang w:eastAsia="fr-FR"/>
@@ -7108,14 +7135,16 @@
         <w:spacing w:before="100" w:beforeAutospacing="1" w:after="100" w:afterAutospacing="1" w:line="240" w:lineRule="auto"/>
         <w:rPr>
           <w:rFonts w:ascii="Times New Roman" w:eastAsia="Times New Roman" w:hAnsi="Times New Roman" w:cs="Times New Roman"/>
-          <w:sz w:val="24"/>
-          <w:szCs w:val="24"/>
-          <w:lang w:eastAsia="fr-FR"/>
-        </w:rPr>
-      </w:pPr>
-      <w:r>
-        <w:rPr>
-          <w:rFonts w:ascii="Times New Roman" w:eastAsia="Times New Roman" w:hAnsi="Times New Roman" w:cs="Times New Roman"/>
+          <w:color w:val="FF0000"/>
+          <w:sz w:val="24"/>
+          <w:szCs w:val="24"/>
+          <w:lang w:eastAsia="fr-FR"/>
+        </w:rPr>
+      </w:pPr>
+      <w:r>
+        <w:rPr>
+          <w:rFonts w:ascii="Times New Roman" w:eastAsia="Times New Roman" w:hAnsi="Times New Roman" w:cs="Times New Roman"/>
+          <w:color w:val="FF0000"/>
           <w:sz w:val="24"/>
           <w:szCs w:val="24"/>
           <w:lang w:eastAsia="fr-FR"/>
@@ -7125,6 +7154,7 @@
       <w:r>
         <w:rPr>
           <w:rFonts w:ascii="Courier New" w:eastAsia="Times New Roman" w:hAnsi="Courier New" w:cs="Courier New"/>
+          <w:color w:val="FF0000"/>
           <w:sz w:val="20"/>
           <w:szCs w:val="20"/>
           <w:lang w:eastAsia="fr-FR"/>
@@ -7135,6 +7165,7 @@
       <w:r>
         <w:rPr>
           <w:rFonts w:ascii="Courier New" w:eastAsia="Times New Roman" w:hAnsi="Courier New" w:cs="Courier New"/>
+          <w:color w:val="FF0000"/>
           <w:sz w:val="20"/>
           <w:szCs w:val="20"/>
           <w:lang w:eastAsia="fr-FR"/>
@@ -7145,6 +7176,7 @@
       <w:r>
         <w:rPr>
           <w:rFonts w:ascii="Courier New" w:eastAsia="Times New Roman" w:hAnsi="Courier New" w:cs="Courier New"/>
+          <w:color w:val="FF0000"/>
           <w:sz w:val="20"/>
           <w:szCs w:val="20"/>
           <w:lang w:eastAsia="fr-FR"/>
@@ -7154,6 +7186,7 @@
       <w:r>
         <w:rPr>
           <w:rFonts w:ascii="Times New Roman" w:eastAsia="Times New Roman" w:hAnsi="Times New Roman" w:cs="Times New Roman"/>
+          <w:color w:val="FF0000"/>
           <w:sz w:val="24"/>
           <w:szCs w:val="24"/>
           <w:lang w:eastAsia="fr-FR"/>
@@ -7166,16 +7199,18 @@
         <w:spacing w:before="100" w:beforeAutospacing="1" w:after="100" w:afterAutospacing="1" w:line="240" w:lineRule="auto"/>
         <w:rPr>
           <w:rFonts w:ascii="Times New Roman" w:eastAsia="Times New Roman" w:hAnsi="Times New Roman" w:cs="Times New Roman"/>
-          <w:sz w:val="24"/>
-          <w:szCs w:val="24"/>
-          <w:lang w:eastAsia="fr-FR"/>
-        </w:rPr>
-      </w:pPr>
-      <w:r>
-        <w:rPr>
-          <w:rFonts w:ascii="Times New Roman" w:eastAsia="Times New Roman" w:hAnsi="Times New Roman" w:cs="Times New Roman"/>
-          <w:b/>
-          <w:bCs/>
+          <w:color w:val="FF0000"/>
+          <w:sz w:val="24"/>
+          <w:szCs w:val="24"/>
+          <w:lang w:eastAsia="fr-FR"/>
+        </w:rPr>
+      </w:pPr>
+      <w:r>
+        <w:rPr>
+          <w:rFonts w:ascii="Times New Roman" w:eastAsia="Times New Roman" w:hAnsi="Times New Roman" w:cs="Times New Roman"/>
+          <w:b/>
+          <w:bCs/>
+          <w:color w:val="FF0000"/>
           <w:sz w:val="24"/>
           <w:szCs w:val="24"/>
           <w:lang w:eastAsia="fr-FR"/>
@@ -7185,6 +7220,7 @@
       <w:r>
         <w:rPr>
           <w:rFonts w:ascii="Times New Roman" w:eastAsia="Times New Roman" w:hAnsi="Times New Roman" w:cs="Times New Roman"/>
+          <w:color w:val="FF0000"/>
           <w:sz w:val="24"/>
           <w:szCs w:val="24"/>
           <w:lang w:eastAsia="fr-FR"/>
@@ -7198,16 +7234,18 @@
         <w:spacing w:before="100" w:beforeAutospacing="1" w:after="100" w:afterAutospacing="1" w:line="240" w:lineRule="auto"/>
         <w:rPr>
           <w:rFonts w:ascii="Times New Roman" w:eastAsia="Times New Roman" w:hAnsi="Times New Roman" w:cs="Times New Roman"/>
-          <w:sz w:val="24"/>
-          <w:szCs w:val="24"/>
-          <w:lang w:eastAsia="fr-FR"/>
-        </w:rPr>
-      </w:pPr>
-      <w:r>
-        <w:rPr>
-          <w:rFonts w:ascii="Times New Roman" w:eastAsia="Times New Roman" w:hAnsi="Times New Roman" w:cs="Times New Roman"/>
-          <w:b/>
-          <w:bCs/>
+          <w:color w:val="FF0000"/>
+          <w:sz w:val="24"/>
+          <w:szCs w:val="24"/>
+          <w:lang w:eastAsia="fr-FR"/>
+        </w:rPr>
+      </w:pPr>
+      <w:r>
+        <w:rPr>
+          <w:rFonts w:ascii="Times New Roman" w:eastAsia="Times New Roman" w:hAnsi="Times New Roman" w:cs="Times New Roman"/>
+          <w:b/>
+          <w:bCs/>
+          <w:color w:val="FF0000"/>
           <w:sz w:val="24"/>
           <w:szCs w:val="24"/>
           <w:lang w:eastAsia="fr-FR"/>
@@ -7217,6 +7255,7 @@
       <w:r>
         <w:rPr>
           <w:rFonts w:ascii="Times New Roman" w:eastAsia="Times New Roman" w:hAnsi="Times New Roman" w:cs="Times New Roman"/>
+          <w:color w:val="FF0000"/>
           <w:sz w:val="24"/>
           <w:szCs w:val="24"/>
           <w:lang w:eastAsia="fr-FR"/>
@@ -7255,16 +7294,19 @@
           <w:rFonts w:ascii="Times New Roman" w:eastAsia="Times New Roman" w:hAnsi="Times New Roman" w:cs="Times New Roman"/>
           <w:b/>
           <w:bCs/>
+          <w:color w:val="FF0000"/>
           <w:sz w:val="36"/>
           <w:szCs w:val="36"/>
           <w:lang w:eastAsia="fr-FR"/>
         </w:rPr>
       </w:pPr>
-      <w:r>
-        <w:rPr>
-          <w:rFonts w:ascii="Times New Roman" w:eastAsia="Times New Roman" w:hAnsi="Times New Roman" w:cs="Times New Roman"/>
-          <w:b/>
-          <w:bCs/>
+      <w:bookmarkStart w:id="0" w:name="_GoBack"/>
+      <w:r>
+        <w:rPr>
+          <w:rFonts w:ascii="Times New Roman" w:eastAsia="Times New Roman" w:hAnsi="Times New Roman" w:cs="Times New Roman"/>
+          <w:b/>
+          <w:bCs/>
+          <w:color w:val="FF0000"/>
           <w:sz w:val="36"/>
           <w:szCs w:val="36"/>
           <w:lang w:eastAsia="fr-FR"/>
@@ -7277,16 +7319,18 @@
         <w:spacing w:before="100" w:beforeAutospacing="1" w:after="100" w:afterAutospacing="1" w:line="240" w:lineRule="auto"/>
         <w:rPr>
           <w:rFonts w:ascii="Times New Roman" w:eastAsia="Times New Roman" w:hAnsi="Times New Roman" w:cs="Times New Roman"/>
-          <w:sz w:val="24"/>
-          <w:szCs w:val="24"/>
-          <w:lang w:eastAsia="fr-FR"/>
-        </w:rPr>
-      </w:pPr>
-      <w:r>
-        <w:rPr>
-          <w:rFonts w:ascii="Times New Roman" w:eastAsia="Times New Roman" w:hAnsi="Times New Roman" w:cs="Times New Roman"/>
-          <w:b/>
-          <w:bCs/>
+          <w:color w:val="FF0000"/>
+          <w:sz w:val="24"/>
+          <w:szCs w:val="24"/>
+          <w:lang w:eastAsia="fr-FR"/>
+        </w:rPr>
+      </w:pPr>
+      <w:r>
+        <w:rPr>
+          <w:rFonts w:ascii="Times New Roman" w:eastAsia="Times New Roman" w:hAnsi="Times New Roman" w:cs="Times New Roman"/>
+          <w:b/>
+          <w:bCs/>
+          <w:color w:val="FF0000"/>
           <w:sz w:val="24"/>
           <w:szCs w:val="24"/>
           <w:lang w:eastAsia="fr-FR"/>
@@ -7297,6 +7341,7 @@
       <w:r>
         <w:rPr>
           <w:rFonts w:ascii="Times New Roman" w:eastAsia="Times New Roman" w:hAnsi="Times New Roman" w:cs="Times New Roman"/>
+          <w:color w:val="FF0000"/>
           <w:sz w:val="24"/>
           <w:szCs w:val="24"/>
           <w:lang w:eastAsia="fr-FR"/>
@@ -7307,6 +7352,7 @@
       <w:r>
         <w:rPr>
           <w:rFonts w:ascii="Courier New" w:eastAsia="Times New Roman" w:hAnsi="Courier New" w:cs="Courier New"/>
+          <w:color w:val="FF0000"/>
           <w:sz w:val="20"/>
           <w:szCs w:val="20"/>
           <w:lang w:eastAsia="fr-FR"/>
@@ -7317,6 +7363,7 @@
       <w:r>
         <w:rPr>
           <w:rFonts w:ascii="Courier New" w:eastAsia="Times New Roman" w:hAnsi="Courier New" w:cs="Courier New"/>
+          <w:color w:val="FF0000"/>
           <w:sz w:val="20"/>
           <w:szCs w:val="20"/>
           <w:lang w:eastAsia="fr-FR"/>
@@ -7329,16 +7376,18 @@
         <w:spacing w:before="100" w:beforeAutospacing="1" w:after="100" w:afterAutospacing="1" w:line="240" w:lineRule="auto"/>
         <w:rPr>
           <w:rFonts w:ascii="Times New Roman" w:eastAsia="Times New Roman" w:hAnsi="Times New Roman" w:cs="Times New Roman"/>
-          <w:sz w:val="24"/>
-          <w:szCs w:val="24"/>
-          <w:lang w:eastAsia="fr-FR"/>
-        </w:rPr>
-      </w:pPr>
-      <w:r>
-        <w:rPr>
-          <w:rFonts w:ascii="Times New Roman" w:eastAsia="Times New Roman" w:hAnsi="Times New Roman" w:cs="Times New Roman"/>
-          <w:b/>
-          <w:bCs/>
+          <w:color w:val="FF0000"/>
+          <w:sz w:val="24"/>
+          <w:szCs w:val="24"/>
+          <w:lang w:eastAsia="fr-FR"/>
+        </w:rPr>
+      </w:pPr>
+      <w:r>
+        <w:rPr>
+          <w:rFonts w:ascii="Times New Roman" w:eastAsia="Times New Roman" w:hAnsi="Times New Roman" w:cs="Times New Roman"/>
+          <w:b/>
+          <w:bCs/>
+          <w:color w:val="FF0000"/>
           <w:sz w:val="24"/>
           <w:szCs w:val="24"/>
           <w:lang w:eastAsia="fr-FR"/>
@@ -7348,6 +7397,7 @@
       <w:r>
         <w:rPr>
           <w:rFonts w:ascii="Times New Roman" w:eastAsia="Times New Roman" w:hAnsi="Times New Roman" w:cs="Times New Roman"/>
+          <w:color w:val="FF0000"/>
           <w:sz w:val="24"/>
           <w:szCs w:val="24"/>
           <w:lang w:eastAsia="fr-FR"/>
@@ -7361,16 +7411,18 @@
         <w:spacing w:before="100" w:beforeAutospacing="1" w:after="100" w:afterAutospacing="1" w:line="240" w:lineRule="auto"/>
         <w:rPr>
           <w:rFonts w:ascii="Times New Roman" w:eastAsia="Times New Roman" w:hAnsi="Times New Roman" w:cs="Times New Roman"/>
-          <w:sz w:val="24"/>
-          <w:szCs w:val="24"/>
-          <w:lang w:eastAsia="fr-FR"/>
-        </w:rPr>
-      </w:pPr>
-      <w:r>
-        <w:rPr>
-          <w:rFonts w:ascii="Times New Roman" w:eastAsia="Times New Roman" w:hAnsi="Times New Roman" w:cs="Times New Roman"/>
-          <w:b/>
-          <w:bCs/>
+          <w:color w:val="FF0000"/>
+          <w:sz w:val="24"/>
+          <w:szCs w:val="24"/>
+          <w:lang w:eastAsia="fr-FR"/>
+        </w:rPr>
+      </w:pPr>
+      <w:r>
+        <w:rPr>
+          <w:rFonts w:ascii="Times New Roman" w:eastAsia="Times New Roman" w:hAnsi="Times New Roman" w:cs="Times New Roman"/>
+          <w:b/>
+          <w:bCs/>
+          <w:color w:val="FF0000"/>
           <w:sz w:val="24"/>
           <w:szCs w:val="24"/>
           <w:lang w:eastAsia="fr-FR"/>
@@ -7380,6 +7432,7 @@
       <w:r>
         <w:rPr>
           <w:rFonts w:ascii="Times New Roman" w:eastAsia="Times New Roman" w:hAnsi="Times New Roman" w:cs="Times New Roman"/>
+          <w:color w:val="FF0000"/>
           <w:sz w:val="24"/>
           <w:szCs w:val="24"/>
           <w:lang w:eastAsia="fr-FR"/>
@@ -7393,16 +7446,18 @@
         <w:spacing w:before="100" w:beforeAutospacing="1" w:after="100" w:afterAutospacing="1" w:line="240" w:lineRule="auto"/>
         <w:rPr>
           <w:rFonts w:ascii="Times New Roman" w:eastAsia="Times New Roman" w:hAnsi="Times New Roman" w:cs="Times New Roman"/>
-          <w:sz w:val="24"/>
-          <w:szCs w:val="24"/>
-          <w:lang w:eastAsia="fr-FR"/>
-        </w:rPr>
-      </w:pPr>
-      <w:r>
-        <w:rPr>
-          <w:rFonts w:ascii="Times New Roman" w:eastAsia="Times New Roman" w:hAnsi="Times New Roman" w:cs="Times New Roman"/>
-          <w:b/>
-          <w:bCs/>
+          <w:color w:val="FF0000"/>
+          <w:sz w:val="24"/>
+          <w:szCs w:val="24"/>
+          <w:lang w:eastAsia="fr-FR"/>
+        </w:rPr>
+      </w:pPr>
+      <w:r>
+        <w:rPr>
+          <w:rFonts w:ascii="Times New Roman" w:eastAsia="Times New Roman" w:hAnsi="Times New Roman" w:cs="Times New Roman"/>
+          <w:b/>
+          <w:bCs/>
+          <w:color w:val="FF0000"/>
           <w:sz w:val="24"/>
           <w:szCs w:val="24"/>
           <w:lang w:eastAsia="fr-FR"/>
@@ -7419,14 +7474,16 @@
         <w:spacing w:before="100" w:beforeAutospacing="1" w:after="100" w:afterAutospacing="1" w:line="240" w:lineRule="auto"/>
         <w:rPr>
           <w:rFonts w:ascii="Times New Roman" w:eastAsia="Times New Roman" w:hAnsi="Times New Roman" w:cs="Times New Roman"/>
-          <w:sz w:val="24"/>
-          <w:szCs w:val="24"/>
-          <w:lang w:eastAsia="fr-FR"/>
-        </w:rPr>
-      </w:pPr>
-      <w:r>
-        <w:rPr>
-          <w:rFonts w:ascii="Courier New" w:eastAsia="Times New Roman" w:hAnsi="Courier New" w:cs="Courier New"/>
+          <w:color w:val="FF0000"/>
+          <w:sz w:val="24"/>
+          <w:szCs w:val="24"/>
+          <w:lang w:eastAsia="fr-FR"/>
+        </w:rPr>
+      </w:pPr>
+      <w:r>
+        <w:rPr>
+          <w:rFonts w:ascii="Courier New" w:eastAsia="Times New Roman" w:hAnsi="Courier New" w:cs="Courier New"/>
+          <w:color w:val="FF0000"/>
           <w:sz w:val="20"/>
           <w:szCs w:val="20"/>
           <w:lang w:eastAsia="fr-FR"/>
@@ -7443,14 +7500,16 @@
         <w:spacing w:before="100" w:beforeAutospacing="1" w:after="100" w:afterAutospacing="1" w:line="240" w:lineRule="auto"/>
         <w:rPr>
           <w:rFonts w:ascii="Times New Roman" w:eastAsia="Times New Roman" w:hAnsi="Times New Roman" w:cs="Times New Roman"/>
-          <w:sz w:val="24"/>
-          <w:szCs w:val="24"/>
-          <w:lang w:eastAsia="fr-FR"/>
-        </w:rPr>
-      </w:pPr>
-      <w:r>
-        <w:rPr>
-          <w:rFonts w:ascii="Courier New" w:eastAsia="Times New Roman" w:hAnsi="Courier New" w:cs="Courier New"/>
+          <w:color w:val="FF0000"/>
+          <w:sz w:val="24"/>
+          <w:szCs w:val="24"/>
+          <w:lang w:eastAsia="fr-FR"/>
+        </w:rPr>
+      </w:pPr>
+      <w:r>
+        <w:rPr>
+          <w:rFonts w:ascii="Courier New" w:eastAsia="Times New Roman" w:hAnsi="Courier New" w:cs="Courier New"/>
+          <w:color w:val="FF0000"/>
           <w:sz w:val="20"/>
           <w:szCs w:val="20"/>
           <w:lang w:eastAsia="fr-FR"/>
@@ -7467,14 +7526,16 @@
         <w:spacing w:before="100" w:beforeAutospacing="1" w:after="100" w:afterAutospacing="1" w:line="240" w:lineRule="auto"/>
         <w:rPr>
           <w:rFonts w:ascii="Times New Roman" w:eastAsia="Times New Roman" w:hAnsi="Times New Roman" w:cs="Times New Roman"/>
-          <w:sz w:val="24"/>
-          <w:szCs w:val="24"/>
-          <w:lang w:eastAsia="fr-FR"/>
-        </w:rPr>
-      </w:pPr>
-      <w:r>
-        <w:rPr>
-          <w:rFonts w:ascii="Courier New" w:eastAsia="Times New Roman" w:hAnsi="Courier New" w:cs="Courier New"/>
+          <w:color w:val="FF0000"/>
+          <w:sz w:val="24"/>
+          <w:szCs w:val="24"/>
+          <w:lang w:eastAsia="fr-FR"/>
+        </w:rPr>
+      </w:pPr>
+      <w:r>
+        <w:rPr>
+          <w:rFonts w:ascii="Courier New" w:eastAsia="Times New Roman" w:hAnsi="Courier New" w:cs="Courier New"/>
+          <w:color w:val="FF0000"/>
           <w:sz w:val="20"/>
           <w:szCs w:val="20"/>
           <w:lang w:eastAsia="fr-FR"/>
@@ -7491,14 +7552,16 @@
         <w:spacing w:before="100" w:beforeAutospacing="1" w:after="100" w:afterAutospacing="1" w:line="240" w:lineRule="auto"/>
         <w:rPr>
           <w:rFonts w:ascii="Times New Roman" w:eastAsia="Times New Roman" w:hAnsi="Times New Roman" w:cs="Times New Roman"/>
-          <w:sz w:val="24"/>
-          <w:szCs w:val="24"/>
-          <w:lang w:eastAsia="fr-FR"/>
-        </w:rPr>
-      </w:pPr>
-      <w:r>
-        <w:rPr>
-          <w:rFonts w:ascii="Courier New" w:eastAsia="Times New Roman" w:hAnsi="Courier New" w:cs="Courier New"/>
+          <w:color w:val="FF0000"/>
+          <w:sz w:val="24"/>
+          <w:szCs w:val="24"/>
+          <w:lang w:eastAsia="fr-FR"/>
+        </w:rPr>
+      </w:pPr>
+      <w:r>
+        <w:rPr>
+          <w:rFonts w:ascii="Courier New" w:eastAsia="Times New Roman" w:hAnsi="Courier New" w:cs="Courier New"/>
+          <w:color w:val="FF0000"/>
           <w:sz w:val="20"/>
           <w:szCs w:val="20"/>
           <w:lang w:eastAsia="fr-FR"/>
@@ -7515,14 +7578,16 @@
         <w:spacing w:before="100" w:beforeAutospacing="1" w:after="100" w:afterAutospacing="1" w:line="240" w:lineRule="auto"/>
         <w:rPr>
           <w:rFonts w:ascii="Times New Roman" w:eastAsia="Times New Roman" w:hAnsi="Times New Roman" w:cs="Times New Roman"/>
-          <w:sz w:val="24"/>
-          <w:szCs w:val="24"/>
-          <w:lang w:eastAsia="fr-FR"/>
-        </w:rPr>
-      </w:pPr>
-      <w:r>
-        <w:rPr>
-          <w:rFonts w:ascii="Courier New" w:eastAsia="Times New Roman" w:hAnsi="Courier New" w:cs="Courier New"/>
+          <w:color w:val="FF0000"/>
+          <w:sz w:val="24"/>
+          <w:szCs w:val="24"/>
+          <w:lang w:eastAsia="fr-FR"/>
+        </w:rPr>
+      </w:pPr>
+      <w:r>
+        <w:rPr>
+          <w:rFonts w:ascii="Courier New" w:eastAsia="Times New Roman" w:hAnsi="Courier New" w:cs="Courier New"/>
+          <w:color w:val="FF0000"/>
           <w:sz w:val="20"/>
           <w:szCs w:val="20"/>
           <w:lang w:eastAsia="fr-FR"/>
@@ -7539,14 +7604,16 @@
         <w:spacing w:before="100" w:beforeAutospacing="1" w:after="100" w:afterAutospacing="1" w:line="240" w:lineRule="auto"/>
         <w:rPr>
           <w:rFonts w:ascii="Times New Roman" w:eastAsia="Times New Roman" w:hAnsi="Times New Roman" w:cs="Times New Roman"/>
-          <w:sz w:val="24"/>
-          <w:szCs w:val="24"/>
-          <w:lang w:eastAsia="fr-FR"/>
-        </w:rPr>
-      </w:pPr>
-      <w:r>
-        <w:rPr>
-          <w:rFonts w:ascii="Courier New" w:eastAsia="Times New Roman" w:hAnsi="Courier New" w:cs="Courier New"/>
+          <w:color w:val="FF0000"/>
+          <w:sz w:val="24"/>
+          <w:szCs w:val="24"/>
+          <w:lang w:eastAsia="fr-FR"/>
+        </w:rPr>
+      </w:pPr>
+      <w:r>
+        <w:rPr>
+          <w:rFonts w:ascii="Courier New" w:eastAsia="Times New Roman" w:hAnsi="Courier New" w:cs="Courier New"/>
+          <w:color w:val="FF0000"/>
           <w:sz w:val="20"/>
           <w:szCs w:val="20"/>
           <w:lang w:eastAsia="fr-FR"/>
@@ -7559,16 +7626,18 @@
         <w:spacing w:before="100" w:beforeAutospacing="1" w:after="100" w:afterAutospacing="1" w:line="240" w:lineRule="auto"/>
         <w:rPr>
           <w:rFonts w:ascii="Times New Roman" w:eastAsia="Times New Roman" w:hAnsi="Times New Roman" w:cs="Times New Roman"/>
-          <w:sz w:val="24"/>
-          <w:szCs w:val="24"/>
-          <w:lang w:eastAsia="fr-FR"/>
-        </w:rPr>
-      </w:pPr>
-      <w:r>
-        <w:rPr>
-          <w:rFonts w:ascii="Times New Roman" w:eastAsia="Times New Roman" w:hAnsi="Times New Roman" w:cs="Times New Roman"/>
-          <w:b/>
-          <w:bCs/>
+          <w:color w:val="FF0000"/>
+          <w:sz w:val="24"/>
+          <w:szCs w:val="24"/>
+          <w:lang w:eastAsia="fr-FR"/>
+        </w:rPr>
+      </w:pPr>
+      <w:r>
+        <w:rPr>
+          <w:rFonts w:ascii="Times New Roman" w:eastAsia="Times New Roman" w:hAnsi="Times New Roman" w:cs="Times New Roman"/>
+          <w:b/>
+          <w:bCs/>
+          <w:color w:val="FF0000"/>
           <w:sz w:val="24"/>
           <w:szCs w:val="24"/>
           <w:lang w:eastAsia="fr-FR"/>
@@ -7585,14 +7654,16 @@
         <w:spacing w:before="100" w:beforeAutospacing="1" w:after="100" w:afterAutospacing="1" w:line="240" w:lineRule="auto"/>
         <w:rPr>
           <w:rFonts w:ascii="Times New Roman" w:eastAsia="Times New Roman" w:hAnsi="Times New Roman" w:cs="Times New Roman"/>
-          <w:sz w:val="24"/>
-          <w:szCs w:val="24"/>
-          <w:lang w:eastAsia="fr-FR"/>
-        </w:rPr>
-      </w:pPr>
-      <w:r>
-        <w:rPr>
-          <w:rFonts w:ascii="Courier New" w:eastAsia="Times New Roman" w:hAnsi="Courier New" w:cs="Courier New"/>
+          <w:color w:val="FF0000"/>
+          <w:sz w:val="24"/>
+          <w:szCs w:val="24"/>
+          <w:lang w:eastAsia="fr-FR"/>
+        </w:rPr>
+      </w:pPr>
+      <w:r>
+        <w:rPr>
+          <w:rFonts w:ascii="Courier New" w:eastAsia="Times New Roman" w:hAnsi="Courier New" w:cs="Courier New"/>
+          <w:color w:val="FF0000"/>
           <w:sz w:val="20"/>
           <w:szCs w:val="20"/>
           <w:lang w:eastAsia="fr-FR"/>
@@ -7602,6 +7673,7 @@
       <w:r>
         <w:rPr>
           <w:rFonts w:ascii="Times New Roman" w:eastAsia="Times New Roman" w:hAnsi="Times New Roman" w:cs="Times New Roman"/>
+          <w:color w:val="FF0000"/>
           <w:sz w:val="24"/>
           <w:szCs w:val="24"/>
           <w:lang w:eastAsia="fr-FR"/>
@@ -7618,14 +7690,16 @@
         <w:spacing w:before="100" w:beforeAutospacing="1" w:after="100" w:afterAutospacing="1" w:line="240" w:lineRule="auto"/>
         <w:rPr>
           <w:rFonts w:ascii="Times New Roman" w:eastAsia="Times New Roman" w:hAnsi="Times New Roman" w:cs="Times New Roman"/>
-          <w:sz w:val="24"/>
-          <w:szCs w:val="24"/>
-          <w:lang w:eastAsia="fr-FR"/>
-        </w:rPr>
-      </w:pPr>
-      <w:r>
-        <w:rPr>
-          <w:rFonts w:ascii="Times New Roman" w:eastAsia="Times New Roman" w:hAnsi="Times New Roman" w:cs="Times New Roman"/>
+          <w:color w:val="FF0000"/>
+          <w:sz w:val="24"/>
+          <w:szCs w:val="24"/>
+          <w:lang w:eastAsia="fr-FR"/>
+        </w:rPr>
+      </w:pPr>
+      <w:r>
+        <w:rPr>
+          <w:rFonts w:ascii="Times New Roman" w:eastAsia="Times New Roman" w:hAnsi="Times New Roman" w:cs="Times New Roman"/>
+          <w:color w:val="FF0000"/>
           <w:sz w:val="24"/>
           <w:szCs w:val="24"/>
           <w:lang w:eastAsia="fr-FR"/>
@@ -7642,14 +7716,16 @@
         <w:spacing w:before="100" w:beforeAutospacing="1" w:after="100" w:afterAutospacing="1" w:line="240" w:lineRule="auto"/>
         <w:rPr>
           <w:rFonts w:ascii="Times New Roman" w:eastAsia="Times New Roman" w:hAnsi="Times New Roman" w:cs="Times New Roman"/>
-          <w:sz w:val="24"/>
-          <w:szCs w:val="24"/>
-          <w:lang w:eastAsia="fr-FR"/>
-        </w:rPr>
-      </w:pPr>
-      <w:r>
-        <w:rPr>
-          <w:rFonts w:ascii="Times New Roman" w:eastAsia="Times New Roman" w:hAnsi="Times New Roman" w:cs="Times New Roman"/>
+          <w:color w:val="FF0000"/>
+          <w:sz w:val="24"/>
+          <w:szCs w:val="24"/>
+          <w:lang w:eastAsia="fr-FR"/>
+        </w:rPr>
+      </w:pPr>
+      <w:r>
+        <w:rPr>
+          <w:rFonts w:ascii="Times New Roman" w:eastAsia="Times New Roman" w:hAnsi="Times New Roman" w:cs="Times New Roman"/>
+          <w:color w:val="FF0000"/>
           <w:sz w:val="24"/>
           <w:szCs w:val="24"/>
           <w:lang w:eastAsia="fr-FR"/>
@@ -7660,6 +7736,7 @@
       <w:r>
         <w:rPr>
           <w:rFonts w:ascii="Times New Roman" w:eastAsia="Times New Roman" w:hAnsi="Times New Roman" w:cs="Times New Roman"/>
+          <w:color w:val="FF0000"/>
           <w:sz w:val="24"/>
           <w:szCs w:val="24"/>
           <w:lang w:eastAsia="fr-FR"/>
@@ -7670,6 +7747,7 @@
       <w:r>
         <w:rPr>
           <w:rFonts w:ascii="Times New Roman" w:eastAsia="Times New Roman" w:hAnsi="Times New Roman" w:cs="Times New Roman"/>
+          <w:color w:val="FF0000"/>
           <w:sz w:val="24"/>
           <w:szCs w:val="24"/>
           <w:lang w:eastAsia="fr-FR"/>
@@ -7682,16 +7760,18 @@
         <w:spacing w:before="100" w:beforeAutospacing="1" w:after="100" w:afterAutospacing="1" w:line="240" w:lineRule="auto"/>
         <w:rPr>
           <w:rFonts w:ascii="Times New Roman" w:eastAsia="Times New Roman" w:hAnsi="Times New Roman" w:cs="Times New Roman"/>
-          <w:sz w:val="24"/>
-          <w:szCs w:val="24"/>
-          <w:lang w:eastAsia="fr-FR"/>
-        </w:rPr>
-      </w:pPr>
-      <w:r>
-        <w:rPr>
-          <w:rFonts w:ascii="Times New Roman" w:eastAsia="Times New Roman" w:hAnsi="Times New Roman" w:cs="Times New Roman"/>
-          <w:b/>
-          <w:bCs/>
+          <w:color w:val="FF0000"/>
+          <w:sz w:val="24"/>
+          <w:szCs w:val="24"/>
+          <w:lang w:eastAsia="fr-FR"/>
+        </w:rPr>
+      </w:pPr>
+      <w:r>
+        <w:rPr>
+          <w:rFonts w:ascii="Times New Roman" w:eastAsia="Times New Roman" w:hAnsi="Times New Roman" w:cs="Times New Roman"/>
+          <w:b/>
+          <w:bCs/>
+          <w:color w:val="FF0000"/>
           <w:sz w:val="24"/>
           <w:szCs w:val="24"/>
           <w:lang w:eastAsia="fr-FR"/>
@@ -7701,6 +7781,7 @@
       <w:r>
         <w:rPr>
           <w:rFonts w:ascii="Times New Roman" w:eastAsia="Times New Roman" w:hAnsi="Times New Roman" w:cs="Times New Roman"/>
+          <w:color w:val="FF0000"/>
           <w:sz w:val="24"/>
           <w:szCs w:val="24"/>
           <w:lang w:eastAsia="fr-FR"/>
@@ -7714,16 +7795,18 @@
         <w:spacing w:before="100" w:beforeAutospacing="1" w:after="100" w:afterAutospacing="1" w:line="240" w:lineRule="auto"/>
         <w:rPr>
           <w:rFonts w:ascii="Times New Roman" w:eastAsia="Times New Roman" w:hAnsi="Times New Roman" w:cs="Times New Roman"/>
-          <w:sz w:val="24"/>
-          <w:szCs w:val="24"/>
-          <w:lang w:eastAsia="fr-FR"/>
-        </w:rPr>
-      </w:pPr>
-      <w:r>
-        <w:rPr>
-          <w:rFonts w:ascii="Times New Roman" w:eastAsia="Times New Roman" w:hAnsi="Times New Roman" w:cs="Times New Roman"/>
-          <w:b/>
-          <w:bCs/>
+          <w:color w:val="FF0000"/>
+          <w:sz w:val="24"/>
+          <w:szCs w:val="24"/>
+          <w:lang w:eastAsia="fr-FR"/>
+        </w:rPr>
+      </w:pPr>
+      <w:r>
+        <w:rPr>
+          <w:rFonts w:ascii="Times New Roman" w:eastAsia="Times New Roman" w:hAnsi="Times New Roman" w:cs="Times New Roman"/>
+          <w:b/>
+          <w:bCs/>
+          <w:color w:val="FF0000"/>
           <w:sz w:val="24"/>
           <w:szCs w:val="24"/>
           <w:lang w:eastAsia="fr-FR"/>
@@ -7733,6 +7816,7 @@
       <w:r>
         <w:rPr>
           <w:rFonts w:ascii="Times New Roman" w:eastAsia="Times New Roman" w:hAnsi="Times New Roman" w:cs="Times New Roman"/>
+          <w:color w:val="FF0000"/>
           <w:sz w:val="24"/>
           <w:szCs w:val="24"/>
           <w:lang w:eastAsia="fr-FR"/>
@@ -7741,6 +7825,7 @@
         <w:t>Java</w:t>
       </w:r>
     </w:p>
+    <w:bookmarkEnd w:id="0"/>
     <w:p>
       <w:pPr>
         <w:spacing w:before="100" w:beforeAutospacing="1" w:after="100" w:afterAutospacing="1" w:line="240" w:lineRule="auto"/>

</xml_diff>